<commit_message>
Add Fnomo Paperclip agents and execution sync
</commit_message>
<xml_diff>
--- a/docs/FNOMO EXECUTION PLAN_26.docx
+++ b/docs/FNOMO EXECUTION PLAN_26.docx
@@ -20,7 +20,7 @@
     <w:p>
       <w:r>
         <w:pict w14:anchorId="73B808C9">
-          <v:rect id="_x0000_i1355" style="width:0;height:1.5pt" o:hralign="center" o:hrstd="t" o:hr="t" fillcolor="#a0a0a0" stroked="f"/>
+          <v:rect id="_x0000_i1025" style="width:0;height:1.5pt" o:hralign="center" o:hrstd="t" o:hr="t" fillcolor="#a0a0a0" stroked="f"/>
         </w:pict>
       </w:r>
     </w:p>
@@ -102,7 +102,7 @@
     <w:p>
       <w:r>
         <w:pict w14:anchorId="7635F948">
-          <v:rect id="_x0000_i1356" style="width:0;height:1.5pt" o:hralign="center" o:hrstd="t" o:hr="t" fillcolor="#a0a0a0" stroked="f"/>
+          <v:rect id="_x0000_i1026" style="width:0;height:1.5pt" o:hralign="center" o:hrstd="t" o:hr="t" fillcolor="#a0a0a0" stroked="f"/>
         </w:pict>
       </w:r>
     </w:p>
@@ -202,7 +202,7 @@
     <w:p>
       <w:r>
         <w:pict w14:anchorId="0FA93F83">
-          <v:rect id="_x0000_i1357" style="width:0;height:1.5pt" o:hralign="center" o:hrstd="t" o:hr="t" fillcolor="#a0a0a0" stroked="f"/>
+          <v:rect id="_x0000_i1027" style="width:0;height:1.5pt" o:hralign="center" o:hrstd="t" o:hr="t" fillcolor="#a0a0a0" stroked="f"/>
         </w:pict>
       </w:r>
     </w:p>
@@ -268,7 +268,7 @@
     <w:p>
       <w:r>
         <w:pict w14:anchorId="6AF63DE8">
-          <v:rect id="_x0000_i1358" style="width:0;height:1.5pt" o:hralign="center" o:hrstd="t" o:hr="t" fillcolor="#a0a0a0" stroked="f"/>
+          <v:rect id="_x0000_i1028" style="width:0;height:1.5pt" o:hralign="center" o:hrstd="t" o:hr="t" fillcolor="#a0a0a0" stroked="f"/>
         </w:pict>
       </w:r>
     </w:p>
@@ -295,13 +295,13 @@
         </w:numPr>
       </w:pPr>
       <w:r>
-        <w:t xml:space="preserve">₹4,899/year (NO DISCOUNT) </w:t>
+        <w:t xml:space="preserve">₹4,899/year  </w:t>
       </w:r>
     </w:p>
     <w:p>
       <w:r>
         <w:pict w14:anchorId="03B1EBC4">
-          <v:rect id="_x0000_i1359" style="width:0;height:1.5pt" o:hralign="center" o:hrstd="t" o:hr="t" fillcolor="#a0a0a0" stroked="f"/>
+          <v:rect id="_x0000_i1029" style="width:0;height:1.5pt" o:hralign="center" o:hrstd="t" o:hr="t" fillcolor="#a0a0a0" stroked="f"/>
         </w:pict>
       </w:r>
     </w:p>
@@ -379,7 +379,7 @@
     <w:p>
       <w:r>
         <w:pict w14:anchorId="5BAE62B1">
-          <v:rect id="_x0000_i1360" style="width:0;height:1.5pt" o:hralign="center" o:hrstd="t" o:hr="t" fillcolor="#a0a0a0" stroked="f"/>
+          <v:rect id="_x0000_i1030" style="width:0;height:1.5pt" o:hralign="center" o:hrstd="t" o:hr="t" fillcolor="#a0a0a0" stroked="f"/>
         </w:pict>
       </w:r>
     </w:p>
@@ -434,7 +434,7 @@
     <w:p>
       <w:r>
         <w:pict w14:anchorId="4C0D0BBF">
-          <v:rect id="_x0000_i1361" style="width:0;height:1.5pt" o:hralign="center" o:hrstd="t" o:hr="t" fillcolor="#a0a0a0" stroked="f"/>
+          <v:rect id="_x0000_i1031" style="width:0;height:1.5pt" o:hralign="center" o:hrstd="t" o:hr="t" fillcolor="#a0a0a0" stroked="f"/>
         </w:pict>
       </w:r>
     </w:p>
@@ -537,7 +537,7 @@
     <w:p>
       <w:r>
         <w:pict w14:anchorId="2B888A5C">
-          <v:rect id="_x0000_i1362" style="width:0;height:1.5pt" o:hralign="center" o:hrstd="t" o:hr="t" fillcolor="#a0a0a0" stroked="f"/>
+          <v:rect id="_x0000_i1032" style="width:0;height:1.5pt" o:hralign="center" o:hrstd="t" o:hr="t" fillcolor="#a0a0a0" stroked="f"/>
         </w:pict>
       </w:r>
     </w:p>
@@ -592,7 +592,7 @@
     <w:p>
       <w:r>
         <w:pict w14:anchorId="3030BB72">
-          <v:rect id="_x0000_i1363" style="width:0;height:1.5pt" o:hralign="center" o:hrstd="t" o:hr="t" fillcolor="#a0a0a0" stroked="f"/>
+          <v:rect id="_x0000_i1033" style="width:0;height:1.5pt" o:hralign="center" o:hrstd="t" o:hr="t" fillcolor="#a0a0a0" stroked="f"/>
         </w:pict>
       </w:r>
     </w:p>
@@ -681,7 +681,7 @@
     <w:p>
       <w:r>
         <w:pict w14:anchorId="5893DDF4">
-          <v:rect id="_x0000_i1364" style="width:0;height:1.5pt" o:hralign="center" o:hrstd="t" o:hr="t" fillcolor="#a0a0a0" stroked="f"/>
+          <v:rect id="_x0000_i1034" style="width:0;height:1.5pt" o:hralign="center" o:hrstd="t" o:hr="t" fillcolor="#a0a0a0" stroked="f"/>
         </w:pict>
       </w:r>
     </w:p>
@@ -723,7 +723,7 @@
     <w:p>
       <w:r>
         <w:pict w14:anchorId="3BB6B5CE">
-          <v:rect id="_x0000_i1365" style="width:0;height:1.5pt" o:hralign="center" o:hrstd="t" o:hr="t" fillcolor="#a0a0a0" stroked="f"/>
+          <v:rect id="_x0000_i1035" style="width:0;height:1.5pt" o:hralign="center" o:hrstd="t" o:hr="t" fillcolor="#a0a0a0" stroked="f"/>
         </w:pict>
       </w:r>
     </w:p>
@@ -750,7 +750,7 @@
     <w:p>
       <w:r>
         <w:pict w14:anchorId="6B696358">
-          <v:rect id="_x0000_i1366" style="width:0;height:1.5pt" o:hralign="center" o:hrstd="t" o:hr="t" fillcolor="#a0a0a0" stroked="f"/>
+          <v:rect id="_x0000_i1036" style="width:0;height:1.5pt" o:hralign="center" o:hrstd="t" o:hr="t" fillcolor="#a0a0a0" stroked="f"/>
         </w:pict>
       </w:r>
     </w:p>
@@ -777,7 +777,7 @@
     <w:p>
       <w:r>
         <w:pict w14:anchorId="45151A0F">
-          <v:rect id="_x0000_i1367" style="width:0;height:1.5pt" o:hralign="center" o:hrstd="t" o:hr="t" fillcolor="#a0a0a0" stroked="f"/>
+          <v:rect id="_x0000_i1037" style="width:0;height:1.5pt" o:hralign="center" o:hrstd="t" o:hr="t" fillcolor="#a0a0a0" stroked="f"/>
         </w:pict>
       </w:r>
     </w:p>
@@ -869,7 +869,7 @@
     <w:p>
       <w:r>
         <w:pict w14:anchorId="55958B4A">
-          <v:rect id="_x0000_i1368" style="width:0;height:1.5pt" o:hralign="center" o:hrstd="t" o:hr="t" fillcolor="#a0a0a0" stroked="f"/>
+          <v:rect id="_x0000_i1038" style="width:0;height:1.5pt" o:hralign="center" o:hrstd="t" o:hr="t" fillcolor="#a0a0a0" stroked="f"/>
         </w:pict>
       </w:r>
     </w:p>
@@ -896,7 +896,7 @@
     <w:p>
       <w:r>
         <w:pict w14:anchorId="650D678D">
-          <v:rect id="_x0000_i1369" style="width:0;height:1.5pt" o:hralign="center" o:hrstd="t" o:hr="t" fillcolor="#a0a0a0" stroked="f"/>
+          <v:rect id="_x0000_i1039" style="width:0;height:1.5pt" o:hralign="center" o:hrstd="t" o:hr="t" fillcolor="#a0a0a0" stroked="f"/>
         </w:pict>
       </w:r>
     </w:p>
@@ -945,7 +945,7 @@
     <w:p>
       <w:r>
         <w:pict w14:anchorId="4E4A8BFA">
-          <v:rect id="_x0000_i1370" style="width:0;height:1.5pt" o:hralign="center" o:hrstd="t" o:hr="t" fillcolor="#a0a0a0" stroked="f"/>
+          <v:rect id="_x0000_i1040" style="width:0;height:1.5pt" o:hralign="center" o:hrstd="t" o:hr="t" fillcolor="#a0a0a0" stroked="f"/>
         </w:pict>
       </w:r>
     </w:p>
@@ -1002,7 +1002,13 @@
         </w:numPr>
       </w:pPr>
       <w:r>
-        <w:t xml:space="preserve">100 outreach </w:t>
+        <w:t xml:space="preserve">100 </w:t>
+      </w:r>
+      <w:r>
+        <w:t>outreaches</w:t>
+      </w:r>
+      <w:r>
+        <w:t xml:space="preserve"> </w:t>
       </w:r>
     </w:p>
     <w:p>
@@ -1052,7 +1058,7 @@
     <w:p>
       <w:r>
         <w:pict w14:anchorId="1CE8C40C">
-          <v:rect id="_x0000_i1371" style="width:0;height:1.5pt" o:hralign="center" o:hrstd="t" o:hr="t" fillcolor="#a0a0a0" stroked="f"/>
+          <v:rect id="_x0000_i1041" style="width:0;height:1.5pt" o:hralign="center" o:hrstd="t" o:hr="t" fillcolor="#a0a0a0" stroked="f"/>
         </w:pict>
       </w:r>
     </w:p>
@@ -1155,7 +1161,7 @@
     <w:p>
       <w:r>
         <w:pict w14:anchorId="28B5CC1D">
-          <v:rect id="_x0000_i1372" style="width:0;height:1.5pt" o:hralign="center" o:hrstd="t" o:hr="t" fillcolor="#a0a0a0" stroked="f"/>
+          <v:rect id="_x0000_i1042" style="width:0;height:1.5pt" o:hralign="center" o:hrstd="t" o:hr="t" fillcolor="#a0a0a0" stroked="f"/>
         </w:pict>
       </w:r>
     </w:p>
@@ -1177,7 +1183,7 @@
     <w:p>
       <w:r>
         <w:pict w14:anchorId="61644083">
-          <v:rect id="_x0000_i1373" style="width:0;height:1.5pt" o:hralign="center" o:hrstd="t" o:hr="t" fillcolor="#a0a0a0" stroked="f"/>
+          <v:rect id="_x0000_i1043" style="width:0;height:1.5pt" o:hralign="center" o:hrstd="t" o:hr="t" fillcolor="#a0a0a0" stroked="f"/>
         </w:pict>
       </w:r>
     </w:p>
@@ -1239,7 +1245,7 @@
     <w:p>
       <w:r>
         <w:pict w14:anchorId="5E0BC278">
-          <v:rect id="_x0000_i1374" style="width:0;height:1.5pt" o:hralign="center" o:hrstd="t" o:hr="t" fillcolor="#a0a0a0" stroked="f"/>
+          <v:rect id="_x0000_i1044" style="width:0;height:1.5pt" o:hralign="center" o:hrstd="t" o:hr="t" fillcolor="#a0a0a0" stroked="f"/>
         </w:pict>
       </w:r>
     </w:p>
@@ -1294,7 +1300,7 @@
     <w:p>
       <w:r>
         <w:pict w14:anchorId="0430707B">
-          <v:rect id="_x0000_i1375" style="width:0;height:1.5pt" o:hralign="center" o:hrstd="t" o:hr="t" fillcolor="#a0a0a0" stroked="f"/>
+          <v:rect id="_x0000_i1045" style="width:0;height:1.5pt" o:hralign="center" o:hrstd="t" o:hr="t" fillcolor="#a0a0a0" stroked="f"/>
         </w:pict>
       </w:r>
     </w:p>
@@ -1327,7 +1333,7 @@
     <w:p>
       <w:r>
         <w:pict w14:anchorId="5157CDF6">
-          <v:rect id="_x0000_i1376" style="width:0;height:1.5pt" o:hralign="center" o:hrstd="t" o:hr="t" fillcolor="#a0a0a0" stroked="f"/>
+          <v:rect id="_x0000_i1046" style="width:0;height:1.5pt" o:hralign="center" o:hrstd="t" o:hr="t" fillcolor="#a0a0a0" stroked="f"/>
         </w:pict>
       </w:r>
     </w:p>
@@ -1371,7 +1377,7 @@
     <w:p>
       <w:r>
         <w:pict w14:anchorId="308547CF">
-          <v:rect id="_x0000_i1377" style="width:0;height:1.5pt" o:hralign="center" o:hrstd="t" o:hr="t" fillcolor="#a0a0a0" stroked="f"/>
+          <v:rect id="_x0000_i1047" style="width:0;height:1.5pt" o:hralign="center" o:hrstd="t" o:hr="t" fillcolor="#a0a0a0" stroked="f"/>
         </w:pict>
       </w:r>
     </w:p>
@@ -1393,7 +1399,7 @@
     <w:p>
       <w:r>
         <w:pict w14:anchorId="0420AA31">
-          <v:rect id="_x0000_i1378" style="width:0;height:1.5pt" o:hralign="center" o:hrstd="t" o:hr="t" fillcolor="#a0a0a0" stroked="f"/>
+          <v:rect id="_x0000_i1048" style="width:0;height:1.5pt" o:hralign="center" o:hrstd="t" o:hr="t" fillcolor="#a0a0a0" stroked="f"/>
         </w:pict>
       </w:r>
     </w:p>
@@ -1437,7 +1443,7 @@
     <w:p>
       <w:r>
         <w:pict w14:anchorId="742DD30B">
-          <v:rect id="_x0000_i1379" style="width:0;height:1.5pt" o:hralign="center" o:hrstd="t" o:hr="t" fillcolor="#a0a0a0" stroked="f"/>
+          <v:rect id="_x0000_i1049" style="width:0;height:1.5pt" o:hralign="center" o:hrstd="t" o:hr="t" fillcolor="#a0a0a0" stroked="f"/>
         </w:pict>
       </w:r>
     </w:p>
@@ -1482,7 +1488,7 @@
     <w:p>
       <w:r>
         <w:pict w14:anchorId="1D064482">
-          <v:rect id="_x0000_i1380" style="width:0;height:1.5pt" o:hralign="center" o:hrstd="t" o:hr="t" fillcolor="#a0a0a0" stroked="f"/>
+          <v:rect id="_x0000_i1050" style="width:0;height:1.5pt" o:hralign="center" o:hrstd="t" o:hr="t" fillcolor="#a0a0a0" stroked="f"/>
         </w:pict>
       </w:r>
     </w:p>
@@ -1526,7 +1532,7 @@
     <w:p>
       <w:r>
         <w:pict w14:anchorId="147EFE47">
-          <v:rect id="_x0000_i1381" style="width:0;height:1.5pt" o:hralign="center" o:hrstd="t" o:hr="t" fillcolor="#a0a0a0" stroked="f"/>
+          <v:rect id="_x0000_i1051" style="width:0;height:1.5pt" o:hralign="center" o:hrstd="t" o:hr="t" fillcolor="#a0a0a0" stroked="f"/>
         </w:pict>
       </w:r>
     </w:p>
@@ -1570,7 +1576,7 @@
     <w:p>
       <w:r>
         <w:pict w14:anchorId="66EDB578">
-          <v:rect id="_x0000_i1382" style="width:0;height:1.5pt" o:hralign="center" o:hrstd="t" o:hr="t" fillcolor="#a0a0a0" stroked="f"/>
+          <v:rect id="_x0000_i1052" style="width:0;height:1.5pt" o:hralign="center" o:hrstd="t" o:hr="t" fillcolor="#a0a0a0" stroked="f"/>
         </w:pict>
       </w:r>
     </w:p>
@@ -1592,7 +1598,7 @@
     <w:p>
       <w:r>
         <w:pict w14:anchorId="4857A7F7">
-          <v:rect id="_x0000_i1383" style="width:0;height:1.5pt" o:hralign="center" o:hrstd="t" o:hr="t" fillcolor="#a0a0a0" stroked="f"/>
+          <v:rect id="_x0000_i1053" style="width:0;height:1.5pt" o:hralign="center" o:hrstd="t" o:hr="t" fillcolor="#a0a0a0" stroked="f"/>
         </w:pict>
       </w:r>
     </w:p>
@@ -1647,7 +1653,7 @@
     <w:p>
       <w:r>
         <w:pict w14:anchorId="65D393BB">
-          <v:rect id="_x0000_i1384" style="width:0;height:1.5pt" o:hralign="center" o:hrstd="t" o:hr="t" fillcolor="#a0a0a0" stroked="f"/>
+          <v:rect id="_x0000_i1054" style="width:0;height:1.5pt" o:hralign="center" o:hrstd="t" o:hr="t" fillcolor="#a0a0a0" stroked="f"/>
         </w:pict>
       </w:r>
     </w:p>
@@ -1685,7 +1691,7 @@
     <w:p>
       <w:r>
         <w:pict w14:anchorId="00D76772">
-          <v:rect id="_x0000_i1385" style="width:0;height:1.5pt" o:hralign="center" o:hrstd="t" o:hr="t" fillcolor="#a0a0a0" stroked="f"/>
+          <v:rect id="_x0000_i1055" style="width:0;height:1.5pt" o:hralign="center" o:hrstd="t" o:hr="t" fillcolor="#a0a0a0" stroked="f"/>
         </w:pict>
       </w:r>
     </w:p>
@@ -1729,7 +1735,7 @@
     <w:p>
       <w:r>
         <w:pict w14:anchorId="62A83337">
-          <v:rect id="_x0000_i1386" style="width:0;height:1.5pt" o:hralign="center" o:hrstd="t" o:hr="t" fillcolor="#a0a0a0" stroked="f"/>
+          <v:rect id="_x0000_i1056" style="width:0;height:1.5pt" o:hralign="center" o:hrstd="t" o:hr="t" fillcolor="#a0a0a0" stroked="f"/>
         </w:pict>
       </w:r>
     </w:p>
@@ -1774,7 +1780,7 @@
       <w:r>
         <w:lastRenderedPageBreak/>
         <w:pict w14:anchorId="69C1A4AA">
-          <v:rect id="_x0000_i1387" style="width:0;height:1.5pt" o:hralign="center" o:hrstd="t" o:hr="t" fillcolor="#a0a0a0" stroked="f"/>
+          <v:rect id="_x0000_i1057" style="width:0;height:1.5pt" o:hralign="center" o:hrstd="t" o:hr="t" fillcolor="#a0a0a0" stroked="f"/>
         </w:pict>
       </w:r>
     </w:p>
@@ -1796,7 +1802,7 @@
     <w:p>
       <w:r>
         <w:pict w14:anchorId="44D6F156">
-          <v:rect id="_x0000_i1388" style="width:0;height:1.5pt" o:hralign="center" o:hrstd="t" o:hr="t" fillcolor="#a0a0a0" stroked="f"/>
+          <v:rect id="_x0000_i1058" style="width:0;height:1.5pt" o:hralign="center" o:hrstd="t" o:hr="t" fillcolor="#a0a0a0" stroked="f"/>
         </w:pict>
       </w:r>
     </w:p>
@@ -1840,7 +1846,7 @@
     <w:p>
       <w:r>
         <w:pict w14:anchorId="04F55972">
-          <v:rect id="_x0000_i1389" style="width:0;height:1.5pt" o:hralign="center" o:hrstd="t" o:hr="t" fillcolor="#a0a0a0" stroked="f"/>
+          <v:rect id="_x0000_i1059" style="width:0;height:1.5pt" o:hralign="center" o:hrstd="t" o:hr="t" fillcolor="#a0a0a0" stroked="f"/>
         </w:pict>
       </w:r>
     </w:p>
@@ -1906,7 +1912,7 @@
     <w:p>
       <w:r>
         <w:pict w14:anchorId="53751ECA">
-          <v:rect id="_x0000_i1390" style="width:0;height:1.5pt" o:hralign="center" o:hrstd="t" o:hr="t" fillcolor="#a0a0a0" stroked="f"/>
+          <v:rect id="_x0000_i1060" style="width:0;height:1.5pt" o:hralign="center" o:hrstd="t" o:hr="t" fillcolor="#a0a0a0" stroked="f"/>
         </w:pict>
       </w:r>
     </w:p>
@@ -1961,7 +1967,7 @@
     <w:p>
       <w:r>
         <w:pict w14:anchorId="4F2B03F3">
-          <v:rect id="_x0000_i1391" style="width:0;height:1.5pt" o:hralign="center" o:hrstd="t" o:hr="t" fillcolor="#a0a0a0" stroked="f"/>
+          <v:rect id="_x0000_i1061" style="width:0;height:1.5pt" o:hralign="center" o:hrstd="t" o:hr="t" fillcolor="#a0a0a0" stroked="f"/>
         </w:pict>
       </w:r>
     </w:p>
@@ -1983,7 +1989,7 @@
     <w:p>
       <w:r>
         <w:pict w14:anchorId="40434F94">
-          <v:rect id="_x0000_i1392" style="width:0;height:1.5pt" o:hralign="center" o:hrstd="t" o:hr="t" fillcolor="#a0a0a0" stroked="f"/>
+          <v:rect id="_x0000_i1062" style="width:0;height:1.5pt" o:hralign="center" o:hrstd="t" o:hr="t" fillcolor="#a0a0a0" stroked="f"/>
         </w:pict>
       </w:r>
     </w:p>
@@ -2010,7 +2016,7 @@
     <w:p>
       <w:r>
         <w:pict w14:anchorId="7150B37C">
-          <v:rect id="_x0000_i1393" style="width:0;height:1.5pt" o:hralign="center" o:hrstd="t" o:hr="t" fillcolor="#a0a0a0" stroked="f"/>
+          <v:rect id="_x0000_i1063" style="width:0;height:1.5pt" o:hralign="center" o:hrstd="t" o:hr="t" fillcolor="#a0a0a0" stroked="f"/>
         </w:pict>
       </w:r>
     </w:p>
@@ -2043,7 +2049,7 @@
     <w:p>
       <w:r>
         <w:pict w14:anchorId="40028A44">
-          <v:rect id="_x0000_i1394" style="width:0;height:1.5pt" o:hralign="center" o:hrstd="t" o:hr="t" fillcolor="#a0a0a0" stroked="f"/>
+          <v:rect id="_x0000_i1064" style="width:0;height:1.5pt" o:hralign="center" o:hrstd="t" o:hr="t" fillcolor="#a0a0a0" stroked="f"/>
         </w:pict>
       </w:r>
     </w:p>
@@ -2071,7 +2077,7 @@
       <w:r>
         <w:lastRenderedPageBreak/>
         <w:pict w14:anchorId="3C7F3409">
-          <v:rect id="_x0000_i1395" style="width:0;height:1.5pt" o:hralign="center" o:hrstd="t" o:hr="t" fillcolor="#a0a0a0" stroked="f"/>
+          <v:rect id="_x0000_i1065" style="width:0;height:1.5pt" o:hralign="center" o:hrstd="t" o:hr="t" fillcolor="#a0a0a0" stroked="f"/>
         </w:pict>
       </w:r>
     </w:p>
@@ -2093,7 +2099,7 @@
     <w:p>
       <w:r>
         <w:pict w14:anchorId="76FC153B">
-          <v:rect id="_x0000_i1396" style="width:0;height:1.5pt" o:hralign="center" o:hrstd="t" o:hr="t" fillcolor="#a0a0a0" stroked="f"/>
+          <v:rect id="_x0000_i1066" style="width:0;height:1.5pt" o:hralign="center" o:hrstd="t" o:hr="t" fillcolor="#a0a0a0" stroked="f"/>
         </w:pict>
       </w:r>
     </w:p>
@@ -2214,7 +2220,7 @@
     <w:p>
       <w:r>
         <w:pict w14:anchorId="3FC78214">
-          <v:rect id="_x0000_i1397" style="width:0;height:1.5pt" o:hralign="center" o:hrstd="t" o:hr="t" fillcolor="#a0a0a0" stroked="f"/>
+          <v:rect id="_x0000_i1067" style="width:0;height:1.5pt" o:hralign="center" o:hrstd="t" o:hr="t" fillcolor="#a0a0a0" stroked="f"/>
         </w:pict>
       </w:r>
     </w:p>
@@ -2280,7 +2286,7 @@
     <w:p>
       <w:r>
         <w:pict w14:anchorId="63D606AA">
-          <v:rect id="_x0000_i1398" style="width:0;height:1.5pt" o:hralign="center" o:hrstd="t" o:hr="t" fillcolor="#a0a0a0" stroked="f"/>
+          <v:rect id="_x0000_i1068" style="width:0;height:1.5pt" o:hralign="center" o:hrstd="t" o:hr="t" fillcolor="#a0a0a0" stroked="f"/>
         </w:pict>
       </w:r>
     </w:p>
@@ -2302,7 +2308,7 @@
     <w:p>
       <w:r>
         <w:pict w14:anchorId="24CA99F3">
-          <v:rect id="_x0000_i1399" style="width:0;height:1.5pt" o:hralign="center" o:hrstd="t" o:hr="t" fillcolor="#a0a0a0" stroked="f"/>
+          <v:rect id="_x0000_i1069" style="width:0;height:1.5pt" o:hralign="center" o:hrstd="t" o:hr="t" fillcolor="#a0a0a0" stroked="f"/>
         </w:pict>
       </w:r>
     </w:p>
@@ -2391,7 +2397,7 @@
     <w:p>
       <w:r>
         <w:pict w14:anchorId="0B80D23A">
-          <v:rect id="_x0000_i1400" style="width:0;height:1.5pt" o:hralign="center" o:hrstd="t" o:hr="t" fillcolor="#a0a0a0" stroked="f"/>
+          <v:rect id="_x0000_i1070" style="width:0;height:1.5pt" o:hralign="center" o:hrstd="t" o:hr="t" fillcolor="#a0a0a0" stroked="f"/>
         </w:pict>
       </w:r>
     </w:p>
@@ -2418,7 +2424,7 @@
     <w:p>
       <w:r>
         <w:pict w14:anchorId="680DB177">
-          <v:rect id="_x0000_i1401" style="width:0;height:1.5pt" o:hralign="center" o:hrstd="t" o:hr="t" fillcolor="#a0a0a0" stroked="f"/>
+          <v:rect id="_x0000_i1071" style="width:0;height:1.5pt" o:hralign="center" o:hrstd="t" o:hr="t" fillcolor="#a0a0a0" stroked="f"/>
         </w:pict>
       </w:r>
     </w:p>
@@ -2440,7 +2446,7 @@
     <w:p>
       <w:r>
         <w:pict w14:anchorId="705E1D7C">
-          <v:rect id="_x0000_i1402" style="width:0;height:1.5pt" o:hralign="center" o:hrstd="t" o:hr="t" fillcolor="#a0a0a0" stroked="f"/>
+          <v:rect id="_x0000_i1072" style="width:0;height:1.5pt" o:hralign="center" o:hrstd="t" o:hr="t" fillcolor="#a0a0a0" stroked="f"/>
         </w:pict>
       </w:r>
     </w:p>
@@ -2484,7 +2490,7 @@
     <w:p>
       <w:r>
         <w:pict w14:anchorId="659E1688">
-          <v:rect id="_x0000_i1403" style="width:0;height:1.5pt" o:hralign="center" o:hrstd="t" o:hr="t" fillcolor="#a0a0a0" stroked="f"/>
+          <v:rect id="_x0000_i1073" style="width:0;height:1.5pt" o:hralign="center" o:hrstd="t" o:hr="t" fillcolor="#a0a0a0" stroked="f"/>
         </w:pict>
       </w:r>
     </w:p>
@@ -2539,7 +2545,7 @@
     <w:p>
       <w:r>
         <w:pict w14:anchorId="7CD33C3D">
-          <v:rect id="_x0000_i1404" style="width:0;height:1.5pt" o:hralign="center" o:hrstd="t" o:hr="t" fillcolor="#a0a0a0" stroked="f"/>
+          <v:rect id="_x0000_i1074" style="width:0;height:1.5pt" o:hralign="center" o:hrstd="t" o:hr="t" fillcolor="#a0a0a0" stroked="f"/>
         </w:pict>
       </w:r>
     </w:p>
@@ -2572,7 +2578,7 @@
     <w:p>
       <w:r>
         <w:pict w14:anchorId="4EBAF263">
-          <v:rect id="_x0000_i1405" style="width:0;height:1.5pt" o:hralign="center" o:hrstd="t" o:hr="t" fillcolor="#a0a0a0" stroked="f"/>
+          <v:rect id="_x0000_i1075" style="width:0;height:1.5pt" o:hralign="center" o:hrstd="t" o:hr="t" fillcolor="#a0a0a0" stroked="f"/>
         </w:pict>
       </w:r>
     </w:p>
@@ -2594,7 +2600,7 @@
     <w:p>
       <w:r>
         <w:pict w14:anchorId="74F18E1D">
-          <v:rect id="_x0000_i1406" style="width:0;height:1.5pt" o:hralign="center" o:hrstd="t" o:hr="t" fillcolor="#a0a0a0" stroked="f"/>
+          <v:rect id="_x0000_i1076" style="width:0;height:1.5pt" o:hralign="center" o:hrstd="t" o:hr="t" fillcolor="#a0a0a0" stroked="f"/>
         </w:pict>
       </w:r>
     </w:p>
@@ -2671,7 +2677,7 @@
     <w:p>
       <w:r>
         <w:pict w14:anchorId="71E5D9AE">
-          <v:rect id="_x0000_i1407" style="width:0;height:1.5pt" o:hralign="center" o:hrstd="t" o:hr="t" fillcolor="#a0a0a0" stroked="f"/>
+          <v:rect id="_x0000_i1077" style="width:0;height:1.5pt" o:hralign="center" o:hrstd="t" o:hr="t" fillcolor="#a0a0a0" stroked="f"/>
         </w:pict>
       </w:r>
     </w:p>
@@ -2709,7 +2715,7 @@
     <w:p>
       <w:r>
         <w:pict w14:anchorId="19DCDED3">
-          <v:rect id="_x0000_i1408" style="width:0;height:1.5pt" o:hralign="center" o:hrstd="t" o:hr="t" fillcolor="#a0a0a0" stroked="f"/>
+          <v:rect id="_x0000_i1078" style="width:0;height:1.5pt" o:hralign="center" o:hrstd="t" o:hr="t" fillcolor="#a0a0a0" stroked="f"/>
         </w:pict>
       </w:r>
     </w:p>
@@ -2765,7 +2771,7 @@
     <w:p>
       <w:r>
         <w:pict w14:anchorId="495D0CCF">
-          <v:rect id="_x0000_i1409" style="width:0;height:1.5pt" o:hralign="center" o:hrstd="t" o:hr="t" fillcolor="#a0a0a0" stroked="f"/>
+          <v:rect id="_x0000_i1079" style="width:0;height:1.5pt" o:hralign="center" o:hrstd="t" o:hr="t" fillcolor="#a0a0a0" stroked="f"/>
         </w:pict>
       </w:r>
     </w:p>
@@ -8814,6 +8820,7 @@
   <w:style w:type="character" w:default="1" w:styleId="DefaultParagraphFont">
     <w:name w:val="Default Paragraph Font"/>
     <w:uiPriority w:val="1"/>
+    <w:semiHidden/>
     <w:unhideWhenUsed/>
   </w:style>
   <w:style w:type="table" w:default="1" w:styleId="TableNormal">

</xml_diff>